<commit_message>
feat(S1): Darvy Valtine passe Responsable Impact
</commit_message>
<xml_diff>
--- a/docs/GET409_S1_RelaisYoon.docx
+++ b/docs/GET409_S1_RelaisYoon.docx
@@ -3169,7 +3169,7 @@
               <w:rPr>
                 <w:sz w:val="18"/>
               </w:rPr>
-              <w:t>Master Prompt Engineer et Responsable Impact</w:t>
+              <w:t>Master Prompt Engineer</w:t>
             </w:r>
           </w:p>
         </w:tc>
@@ -3227,7 +3227,7 @@
               <w:rPr>
                 <w:sz w:val="18"/>
               </w:rPr>
-              <w:t>Dev UI (No-Code), co-bâtisseur — profil bâtisseur web (HTML, PHP, init backend sur GitHub), selon rolesEquipe.docx</w:t>
+              <w:t>Responsable Impact (décision équipe du 23 septembre 2026)</w:t>
             </w:r>
           </w:p>
         </w:tc>
@@ -3560,7 +3560,7 @@
               <w:rPr>
                 <w:sz w:val="18"/>
               </w:rPr>
-              <w:t>Master Prompt Engineer et Responsable Impact</w:t>
+              <w:t>Master Prompt Engineer</w:t>
             </w:r>
           </w:p>
         </w:tc>

</xml_diff>

<commit_message>
feat(S1): e-mails GitHub Rogelle + Darvy
</commit_message>
<xml_diff>
--- a/docs/GET409_S1_RelaisYoon.docx
+++ b/docs/GET409_S1_RelaisYoon.docx
@@ -3197,7 +3197,7 @@
               <w:rPr>
                 <w:sz w:val="18"/>
               </w:rPr>
-              <w:t>invitation Write envoyée, acceptation en attente</w:t>
+              <w:t>rogellereolia3@gmail.com — invitation acceptée le 23 septembre 2026</w:t>
             </w:r>
           </w:p>
         </w:tc>
@@ -3255,7 +3255,7 @@
               <w:rPr>
                 <w:sz w:val="18"/>
               </w:rPr>
-              <w:t>non communiqué</w:t>
+              <w:t>darvyvaltine@gmail.com — invitation acceptée le 23 septembre 2026</w:t>
             </w:r>
           </w:p>
         </w:tc>
@@ -3590,7 +3590,7 @@
               <w:rPr>
                 <w:sz w:val="18"/>
               </w:rPr>
-              <w:t>à saisir par Rogelle — non communiqué</w:t>
+              <w:t>rogellereolia3@gmail.com</w:t>
             </w:r>
           </w:p>
         </w:tc>

</xml_diff>